<commit_message>
embed the two-key authority figure; add the analog workflow and AI four-levels sections
- docs/two-key-authority.svg: the two-key authority model as a figure
  (source of truth, renders on GitHub); docs/two-key-authority.png is the
  raster twin for the .docx/.pptx, which cannot embed SVG
- TUTORIAL EN/ZH: figure embedded in Part 0.4 with caption; selfcheck now
  requires the assets and checks bilingual figure parity
- TUTORIAL EN/ZH Part 9: 9.5 the ~20-phase analog design workflow grouped
  as Specs->Physics->Architecture->Optimization->Statistics->Layout->Silicon;
  9.6 the philosophy vs 'draw schematic->SPICE->layout'; 9.7 the four levels
  of AI in analog design (L3 Synopsys analog layout synthesis, L4 Siemens
  self-verifying agents) tied back to the two-key contract
- deck: +4 slides each (diagram, workflow, philosophy, four levels) -> 39;
  slide_image helper in deck.py; md2docx now embeds images
- deliverables zip regenerated (38 entries)
</commit_message>
<xml_diff>
--- a/dist/gstack-tutorial-2_EN.docx
+++ b/dist/gstack-tutorial-2_EN.docx
@@ -4564,6 +4564,91 @@
     </w:p>
     <w:p>
       <w:pPr>
+        <w:spacing w:before="120" w:after="40"/>
+        <w:jc w:val="center"/>
+      </w:pPr>
+      <w:r>
+        <w:drawing>
+          <wp:inline xmlns:a="http://schemas.openxmlformats.org/drawingml/2006/main" xmlns:pic="http://schemas.openxmlformats.org/drawingml/2006/picture">
+            <wp:extent cx="5616000" cy="2824518"/>
+            <wp:docPr id="1" name="Picture 1"/>
+            <wp:cNvGraphicFramePr>
+              <a:graphicFrameLocks noChangeAspect="1"/>
+            </wp:cNvGraphicFramePr>
+            <a:graphic>
+              <a:graphicData uri="http://schemas.openxmlformats.org/drawingml/2006/picture">
+                <pic:pic>
+                  <pic:nvPicPr>
+                    <pic:cNvPr id="0" name="two-key-authority.png"/>
+                    <pic:cNvPicPr/>
+                  </pic:nvPicPr>
+                  <pic:blipFill>
+                    <a:blip r:embed="rId9"/>
+                    <a:stretch>
+                      <a:fillRect/>
+                    </a:stretch>
+                  </pic:blipFill>
+                  <pic:spPr>
+                    <a:xfrm>
+                      <a:off x="0" y="0"/>
+                      <a:ext cx="5616000" cy="2824518"/>
+                    </a:xfrm>
+                    <a:prstGeom prst="rect"/>
+                  </pic:spPr>
+                </pic:pic>
+              </a:graphicData>
+            </a:graphic>
+          </wp:inline>
+        </w:drawing>
+      </w:r>
+    </w:p>
+    <w:p>
+      <w:pPr>
+        <w:spacing w:after="160"/>
+        <w:jc w:val="center"/>
+      </w:pPr>
+      <w:r>
+        <w:rPr>
+          <w:rFonts w:ascii="Calibri" w:hAnsi="Calibri" w:eastAsia="微软雅黑"/>
+          <w:b w:val="0"/>
+          <w:color w:val="555F6D"/>
+          <w:sz w:val="18"/>
+        </w:rPr>
+        <w:t>Figure 0-1 — The two-key authority model in one picture. Prose version with the</w:t>
+      </w:r>
+    </w:p>
+    <w:p>
+      <w:pPr>
+        <w:spacing w:after="120" w:line="288" w:lineRule="auto"/>
+      </w:pPr>
+      <w:r>
+        <w:rPr>
+          <w:rFonts w:ascii="Calibri" w:hAnsi="Calibri" w:eastAsia="微软雅黑"/>
+          <w:b w:val="0"/>
+          <w:sz w:val="21"/>
+        </w:rPr>
+        <w:t>RACI columns and the three veto rights: [</w:t>
+      </w:r>
+      <w:r>
+        <w:rPr>
+          <w:rFonts w:ascii="Consolas" w:hAnsi="Consolas" w:eastAsia="Consolas"/>
+          <w:b w:val="0"/>
+          <w:color w:val="A31D1D"/>
+          <w:sz w:val="20"/>
+        </w:rPr>
+        <w:t>docs/expertise_division.md</w:t>
+      </w:r>
+      <w:r>
+        <w:rPr>
+          <w:rFonts w:ascii="Calibri" w:hAnsi="Calibri" w:eastAsia="微软雅黑"/>
+          <w:b w:val="0"/>
+          <w:sz w:val="21"/>
+        </w:rPr>
+        <w:t>](docs/expertise_division.md).</w:t>
+      </w:r>
+    </w:p>
+    <w:p>
+      <w:pPr>
         <w:keepNext/>
         <w:spacing w:before="280" w:after="100"/>
       </w:pPr>
@@ -16287,6 +16372,2260 @@
         </w:rPr>
         <w:t>The agent named one assumption likely to be wrong.</w:t>
       </w:r>
+    </w:p>
+    <w:p>
+      <w:pPr>
+        <w:pStyle w:val="ListBullet"/>
+        <w:spacing w:after="40"/>
+      </w:pPr>
+      <w:r>
+        <w:rPr>
+          <w:rFonts w:ascii="Calibri" w:hAnsi="Calibri" w:eastAsia="微软雅黑"/>
+          <w:b w:val="0"/>
+          <w:color w:val="006EA6"/>
+          <w:sz w:val="21"/>
+        </w:rPr>
+        <w:t xml:space="preserve">☐ </w:t>
+      </w:r>
+      <w:r>
+        <w:rPr>
+          <w:rFonts w:ascii="Calibri" w:hAnsi="Calibri" w:eastAsia="微软雅黑"/>
+          <w:b w:val="0"/>
+          <w:sz w:val="21"/>
+        </w:rPr>
+        <w:t>For every dispatch you can name the AI level used (see 9.7) **and the</w:t>
+      </w:r>
+    </w:p>
+    <w:p>
+      <w:pPr>
+        <w:spacing w:after="120" w:line="288" w:lineRule="auto"/>
+      </w:pPr>
+      <w:r>
+        <w:rPr>
+          <w:rFonts w:ascii="Calibri" w:hAnsi="Calibri" w:eastAsia="微软雅黑"/>
+          <w:b w:val="0"/>
+          <w:sz w:val="21"/>
+        </w:rPr>
+        <w:t>engine that verified the result** — not the chatbot, the engine.</w:t>
+      </w:r>
+    </w:p>
+    <w:p>
+      <w:pPr>
+        <w:spacing w:before="40" w:after="40"/>
+        <w:pBdr>
+          <w:bottom w:val="single" w:sz="6" w:color="C7D0D9"/>
+        </w:pBdr>
+      </w:pPr>
+    </w:p>
+    <w:p>
+      <w:pPr>
+        <w:keepNext/>
+        <w:spacing w:before="280" w:after="100"/>
+      </w:pPr>
+      <w:r>
+        <w:rPr>
+          <w:rFonts w:ascii="Calibri" w:hAnsi="Calibri" w:eastAsia="微软雅黑"/>
+          <w:b/>
+          <w:color w:val="061F32"/>
+          <w:sz w:val="32"/>
+        </w:rPr>
+        <w:t>9.5 The workflow the analog agent enforces</w:t>
+      </w:r>
+    </w:p>
+    <w:p>
+      <w:pPr>
+        <w:spacing w:after="120" w:line="288" w:lineRule="auto"/>
+      </w:pPr>
+      <w:r>
+        <w:rPr>
+          <w:rFonts w:ascii="Calibri" w:hAnsi="Calibri" w:eastAsia="微软雅黑"/>
+          <w:b w:val="0"/>
+          <w:sz w:val="21"/>
+        </w:rPr>
+        <w:t>Part 5 taught a digital line: RTL → GDS through four gates. Ask the analog agent</w:t>
+      </w:r>
+    </w:p>
+    <w:p>
+      <w:pPr>
+        <w:spacing w:after="120" w:line="288" w:lineRule="auto"/>
+      </w:pPr>
+      <w:r>
+        <w:rPr>
+          <w:rFonts w:ascii="Calibri" w:hAnsi="Calibri" w:eastAsia="微软雅黑"/>
+          <w:b w:val="0"/>
+          <w:sz w:val="21"/>
+        </w:rPr>
+        <w:t xml:space="preserve">to design a low-noise CMOS sensor amplifier and it will </w:t>
+      </w:r>
+      <w:r>
+        <w:rPr>
+          <w:rFonts w:ascii="Calibri" w:hAnsi="Calibri" w:eastAsia="微软雅黑"/>
+          <w:b/>
+          <w:sz w:val="21"/>
+        </w:rPr>
+        <w:t>not</w:t>
+      </w:r>
+      <w:r>
+        <w:rPr>
+          <w:rFonts w:ascii="Calibri" w:hAnsi="Calibri" w:eastAsia="微软雅黑"/>
+          <w:b w:val="0"/>
+          <w:sz w:val="21"/>
+        </w:rPr>
+        <w:t xml:space="preserve"> start by drawing a</w:t>
+      </w:r>
+    </w:p>
+    <w:p>
+      <w:pPr>
+        <w:spacing w:after="120" w:line="288" w:lineRule="auto"/>
+      </w:pPr>
+      <w:r>
+        <w:rPr>
+          <w:rFonts w:ascii="Calibri" w:hAnsi="Calibri" w:eastAsia="微软雅黑"/>
+          <w:b w:val="0"/>
+          <w:sz w:val="21"/>
+        </w:rPr>
+        <w:t>schematic. It starts with the sensor and the product spec, and it works through</w:t>
+      </w:r>
+    </w:p>
+    <w:p>
+      <w:pPr>
+        <w:spacing w:after="120" w:line="288" w:lineRule="auto"/>
+      </w:pPr>
+      <w:r>
+        <w:rPr>
+          <w:rFonts w:ascii="Calibri" w:hAnsi="Calibri" w:eastAsia="微软雅黑"/>
+          <w:b w:val="0"/>
+          <w:sz w:val="21"/>
+        </w:rPr>
+        <w:t>roughly twenty phases, in this order:</w:t>
+      </w:r>
+    </w:p>
+    <w:tbl>
+      <w:tblPr>
+        <w:tblStyle w:val="TableGrid"/>
+        <w:tblW w:type="auto" w:w="0"/>
+        <w:jc w:val="center"/>
+        <w:tblLook w:firstColumn="1" w:firstRow="1" w:lastColumn="0" w:lastRow="0" w:noHBand="0" w:noVBand="1" w:val="04A0"/>
+      </w:tblPr>
+      <w:tblGrid>
+        <w:gridCol w:w="3211"/>
+        <w:gridCol w:w="3211"/>
+        <w:gridCol w:w="3211"/>
+      </w:tblGrid>
+      <w:tr>
+        <w:tc>
+          <w:tcPr>
+            <w:tcW w:type="dxa" w:w="3211"/>
+            <w:shd w:val="clear" w:fill="061F32"/>
+          </w:tcPr>
+          <w:p>
+            <w:pPr>
+              <w:spacing w:after="20"/>
+            </w:pPr>
+            <w:r/>
+            <w:r>
+              <w:rPr>
+                <w:rFonts w:ascii="Calibri" w:hAnsi="Calibri" w:eastAsia="微软雅黑"/>
+                <w:b/>
+                <w:color w:val="FFFFFF"/>
+                <w:sz w:val="19"/>
+              </w:rPr>
+              <w:t>#</w:t>
+            </w:r>
+          </w:p>
+        </w:tc>
+        <w:tc>
+          <w:tcPr>
+            <w:tcW w:type="dxa" w:w="3211"/>
+            <w:shd w:val="clear" w:fill="061F32"/>
+          </w:tcPr>
+          <w:p>
+            <w:pPr>
+              <w:spacing w:after="20"/>
+            </w:pPr>
+            <w:r/>
+            <w:r>
+              <w:rPr>
+                <w:rFonts w:ascii="Calibri" w:hAnsi="Calibri" w:eastAsia="微软雅黑"/>
+                <w:b/>
+                <w:color w:val="FFFFFF"/>
+                <w:sz w:val="19"/>
+              </w:rPr>
+              <w:t>Phase</w:t>
+            </w:r>
+          </w:p>
+        </w:tc>
+        <w:tc>
+          <w:tcPr>
+            <w:tcW w:type="dxa" w:w="3211"/>
+            <w:shd w:val="clear" w:fill="061F32"/>
+          </w:tcPr>
+          <w:p>
+            <w:pPr>
+              <w:spacing w:after="20"/>
+            </w:pPr>
+            <w:r/>
+            <w:r>
+              <w:rPr>
+                <w:rFonts w:ascii="Calibri" w:hAnsi="Calibri" w:eastAsia="微软雅黑"/>
+                <w:b/>
+                <w:color w:val="FFFFFF"/>
+                <w:sz w:val="19"/>
+              </w:rPr>
+              <w:t>What it feeds</w:t>
+            </w:r>
+          </w:p>
+        </w:tc>
+      </w:tr>
+      <w:tr>
+        <w:tc>
+          <w:tcPr>
+            <w:tcW w:type="dxa" w:w="3211"/>
+          </w:tcPr>
+          <w:p>
+            <w:pPr>
+              <w:spacing w:after="20"/>
+            </w:pPr>
+            <w:r/>
+            <w:r>
+              <w:rPr>
+                <w:rFonts w:ascii="Calibri" w:hAnsi="Calibri" w:eastAsia="微软雅黑"/>
+                <w:b w:val="0"/>
+                <w:sz w:val="18"/>
+              </w:rPr>
+              <w:t>1</w:t>
+            </w:r>
+          </w:p>
+        </w:tc>
+        <w:tc>
+          <w:tcPr>
+            <w:tcW w:type="dxa" w:w="3211"/>
+          </w:tcPr>
+          <w:p>
+            <w:pPr>
+              <w:spacing w:after="20"/>
+            </w:pPr>
+            <w:r/>
+            <w:r>
+              <w:rPr>
+                <w:rFonts w:ascii="Calibri" w:hAnsi="Calibri" w:eastAsia="微软雅黑"/>
+                <w:b w:val="0"/>
+                <w:sz w:val="18"/>
+              </w:rPr>
+              <w:t>Sensor model and product specifications</w:t>
+            </w:r>
+          </w:p>
+        </w:tc>
+        <w:tc>
+          <w:tcPr>
+            <w:tcW w:type="dxa" w:w="3211"/>
+          </w:tcPr>
+          <w:p>
+            <w:pPr>
+              <w:spacing w:after="20"/>
+            </w:pPr>
+            <w:r/>
+            <w:r>
+              <w:rPr>
+                <w:rFonts w:ascii="Calibri" w:hAnsi="Calibri" w:eastAsia="微软雅黑"/>
+                <w:b w:val="0"/>
+                <w:sz w:val="18"/>
+              </w:rPr>
+              <w:t>the target every later number is judged against</w:t>
+            </w:r>
+          </w:p>
+        </w:tc>
+      </w:tr>
+      <w:tr>
+        <w:tc>
+          <w:tcPr>
+            <w:tcW w:type="dxa" w:w="3211"/>
+          </w:tcPr>
+          <w:p>
+            <w:pPr>
+              <w:spacing w:after="20"/>
+            </w:pPr>
+            <w:r/>
+            <w:r>
+              <w:rPr>
+                <w:rFonts w:ascii="Calibri" w:hAnsi="Calibri" w:eastAsia="微软雅黑"/>
+                <w:b w:val="0"/>
+                <w:sz w:val="18"/>
+              </w:rPr>
+              <w:t>2</w:t>
+            </w:r>
+          </w:p>
+        </w:tc>
+        <w:tc>
+          <w:tcPr>
+            <w:tcW w:type="dxa" w:w="3211"/>
+          </w:tcPr>
+          <w:p>
+            <w:pPr>
+              <w:spacing w:after="20"/>
+            </w:pPr>
+            <w:r/>
+            <w:r>
+              <w:rPr>
+                <w:rFonts w:ascii="Calibri" w:hAnsi="Calibri" w:eastAsia="微软雅黑"/>
+                <w:b w:val="0"/>
+                <w:sz w:val="18"/>
+              </w:rPr>
+              <w:t>Signal / noise / dynamic-range budget</w:t>
+            </w:r>
+          </w:p>
+        </w:tc>
+        <w:tc>
+          <w:tcPr>
+            <w:tcW w:type="dxa" w:w="3211"/>
+          </w:tcPr>
+          <w:p>
+            <w:pPr>
+              <w:spacing w:after="20"/>
+            </w:pPr>
+            <w:r/>
+            <w:r>
+              <w:rPr>
+                <w:rFonts w:ascii="Calibri" w:hAnsi="Calibri" w:eastAsia="微软雅黑"/>
+                <w:b w:val="0"/>
+                <w:sz w:val="18"/>
+              </w:rPr>
+              <w:t>per-block allocations — the spec becomes arithmetic</w:t>
+            </w:r>
+          </w:p>
+        </w:tc>
+      </w:tr>
+      <w:tr>
+        <w:tc>
+          <w:tcPr>
+            <w:tcW w:type="dxa" w:w="3211"/>
+          </w:tcPr>
+          <w:p>
+            <w:pPr>
+              <w:spacing w:after="20"/>
+            </w:pPr>
+            <w:r/>
+            <w:r>
+              <w:rPr>
+                <w:rFonts w:ascii="Calibri" w:hAnsi="Calibri" w:eastAsia="微软雅黑"/>
+                <w:b w:val="0"/>
+                <w:sz w:val="18"/>
+              </w:rPr>
+              <w:t>3</w:t>
+            </w:r>
+          </w:p>
+        </w:tc>
+        <w:tc>
+          <w:tcPr>
+            <w:tcW w:type="dxa" w:w="3211"/>
+          </w:tcPr>
+          <w:p>
+            <w:pPr>
+              <w:spacing w:after="20"/>
+            </w:pPr>
+            <w:r/>
+            <w:r>
+              <w:rPr>
+                <w:rFonts w:ascii="Calibri" w:hAnsi="Calibri" w:eastAsia="微软雅黑"/>
+                <w:b w:val="0"/>
+                <w:sz w:val="18"/>
+              </w:rPr>
+              <w:t>PDK device characterization</w:t>
+            </w:r>
+          </w:p>
+        </w:tc>
+        <w:tc>
+          <w:tcPr>
+            <w:tcW w:type="dxa" w:w="3211"/>
+          </w:tcPr>
+          <w:p>
+            <w:pPr>
+              <w:spacing w:after="20"/>
+            </w:pPr>
+            <w:r/>
+            <w:r>
+              <w:rPr>
+                <w:rFonts w:ascii="Calibri" w:hAnsi="Calibri" w:eastAsia="微软雅黑"/>
+                <w:b w:val="0"/>
+                <w:sz w:val="18"/>
+              </w:rPr>
+              <w:t>real f_T, noise and matching data, not textbook models</w:t>
+            </w:r>
+          </w:p>
+        </w:tc>
+      </w:tr>
+      <w:tr>
+        <w:tc>
+          <w:tcPr>
+            <w:tcW w:type="dxa" w:w="3211"/>
+          </w:tcPr>
+          <w:p>
+            <w:pPr>
+              <w:spacing w:after="20"/>
+            </w:pPr>
+            <w:r/>
+            <w:r>
+              <w:rPr>
+                <w:rFonts w:ascii="Calibri" w:hAnsi="Calibri" w:eastAsia="微软雅黑"/>
+                <w:b w:val="0"/>
+                <w:sz w:val="18"/>
+              </w:rPr>
+              <w:t>4</w:t>
+            </w:r>
+          </w:p>
+        </w:tc>
+        <w:tc>
+          <w:tcPr>
+            <w:tcW w:type="dxa" w:w="3211"/>
+          </w:tcPr>
+          <w:p>
+            <w:pPr>
+              <w:spacing w:after="20"/>
+            </w:pPr>
+            <w:r/>
+            <w:r>
+              <w:rPr>
+                <w:rFonts w:ascii="Calibri" w:hAnsi="Calibri" w:eastAsia="微软雅黑"/>
+                <w:b w:val="0"/>
+                <w:sz w:val="18"/>
+              </w:rPr>
+              <w:t>Architecture comparison</w:t>
+            </w:r>
+          </w:p>
+        </w:tc>
+        <w:tc>
+          <w:tcPr>
+            <w:tcW w:type="dxa" w:w="3211"/>
+          </w:tcPr>
+          <w:p>
+            <w:pPr>
+              <w:spacing w:after="20"/>
+            </w:pPr>
+            <w:r/>
+            <w:r>
+              <w:rPr>
+                <w:rFonts w:ascii="Calibri" w:hAnsi="Calibri" w:eastAsia="微软雅黑"/>
+                <w:b w:val="0"/>
+                <w:sz w:val="18"/>
+              </w:rPr>
+              <w:t>candidates killed on paper, not in silicon</w:t>
+            </w:r>
+          </w:p>
+        </w:tc>
+      </w:tr>
+      <w:tr>
+        <w:tc>
+          <w:tcPr>
+            <w:tcW w:type="dxa" w:w="3211"/>
+          </w:tcPr>
+          <w:p>
+            <w:pPr>
+              <w:spacing w:after="20"/>
+            </w:pPr>
+            <w:r/>
+            <w:r>
+              <w:rPr>
+                <w:rFonts w:ascii="Calibri" w:hAnsi="Calibri" w:eastAsia="微软雅黑"/>
+                <w:b w:val="0"/>
+                <w:sz w:val="18"/>
+              </w:rPr>
+              <w:t>5</w:t>
+            </w:r>
+          </w:p>
+        </w:tc>
+        <w:tc>
+          <w:tcPr>
+            <w:tcW w:type="dxa" w:w="3211"/>
+          </w:tcPr>
+          <w:p>
+            <w:pPr>
+              <w:spacing w:after="20"/>
+            </w:pPr>
+            <w:r/>
+            <w:r>
+              <w:rPr>
+                <w:rFonts w:ascii="Calibri" w:hAnsi="Calibri" w:eastAsia="微软雅黑"/>
+                <w:b w:val="0"/>
+                <w:sz w:val="18"/>
+              </w:rPr>
+              <w:t>g_m/I_D-based first sizing</w:t>
+            </w:r>
+          </w:p>
+        </w:tc>
+        <w:tc>
+          <w:tcPr>
+            <w:tcW w:type="dxa" w:w="3211"/>
+          </w:tcPr>
+          <w:p>
+            <w:pPr>
+              <w:spacing w:after="20"/>
+            </w:pPr>
+            <w:r/>
+            <w:r>
+              <w:rPr>
+                <w:rFonts w:ascii="Calibri" w:hAnsi="Calibri" w:eastAsia="微软雅黑"/>
+                <w:b w:val="0"/>
+                <w:sz w:val="18"/>
+              </w:rPr>
+              <w:t>initial W, L, I_D from lookup, not from guesswork</w:t>
+            </w:r>
+          </w:p>
+        </w:tc>
+      </w:tr>
+      <w:tr>
+        <w:tc>
+          <w:tcPr>
+            <w:tcW w:type="dxa" w:w="3211"/>
+          </w:tcPr>
+          <w:p>
+            <w:pPr>
+              <w:spacing w:after="20"/>
+            </w:pPr>
+            <w:r/>
+            <w:r>
+              <w:rPr>
+                <w:rFonts w:ascii="Calibri" w:hAnsi="Calibri" w:eastAsia="微软雅黑"/>
+                <w:b w:val="0"/>
+                <w:sz w:val="18"/>
+              </w:rPr>
+              <w:t>6</w:t>
+            </w:r>
+          </w:p>
+        </w:tc>
+        <w:tc>
+          <w:tcPr>
+            <w:tcW w:type="dxa" w:w="3211"/>
+          </w:tcPr>
+          <w:p>
+            <w:pPr>
+              <w:spacing w:after="20"/>
+            </w:pPr>
+            <w:r/>
+            <w:r>
+              <w:rPr>
+                <w:rFonts w:ascii="Calibri" w:hAnsi="Calibri" w:eastAsia="微软雅黑"/>
+                <w:b w:val="0"/>
+                <w:sz w:val="18"/>
+              </w:rPr>
+              <w:t>Hand calculation</w:t>
+            </w:r>
+          </w:p>
+        </w:tc>
+        <w:tc>
+          <w:tcPr>
+            <w:tcW w:type="dxa" w:w="3211"/>
+          </w:tcPr>
+          <w:p>
+            <w:pPr>
+              <w:spacing w:after="20"/>
+            </w:pPr>
+            <w:r/>
+            <w:r>
+              <w:rPr>
+                <w:rFonts w:ascii="Calibri" w:hAnsi="Calibri" w:eastAsia="微软雅黑"/>
+                <w:b w:val="0"/>
+                <w:sz w:val="18"/>
+              </w:rPr>
+              <w:t>the number the simulator must be compared against</w:t>
+            </w:r>
+          </w:p>
+        </w:tc>
+      </w:tr>
+      <w:tr>
+        <w:tc>
+          <w:tcPr>
+            <w:tcW w:type="dxa" w:w="3211"/>
+          </w:tcPr>
+          <w:p>
+            <w:pPr>
+              <w:spacing w:after="20"/>
+            </w:pPr>
+            <w:r/>
+            <w:r>
+              <w:rPr>
+                <w:rFonts w:ascii="Calibri" w:hAnsi="Calibri" w:eastAsia="微软雅黑"/>
+                <w:b w:val="0"/>
+                <w:sz w:val="18"/>
+              </w:rPr>
+              <w:t>7</w:t>
+            </w:r>
+          </w:p>
+        </w:tc>
+        <w:tc>
+          <w:tcPr>
+            <w:tcW w:type="dxa" w:w="3211"/>
+          </w:tcPr>
+          <w:p>
+            <w:pPr>
+              <w:spacing w:after="20"/>
+            </w:pPr>
+            <w:r/>
+            <w:r>
+              <w:rPr>
+                <w:rFonts w:ascii="Calibri" w:hAnsi="Calibri" w:eastAsia="微软雅黑"/>
+                <w:b w:val="0"/>
+                <w:sz w:val="18"/>
+              </w:rPr>
+              <w:t>Nominal SPICE</w:t>
+            </w:r>
+          </w:p>
+        </w:tc>
+        <w:tc>
+          <w:tcPr>
+            <w:tcW w:type="dxa" w:w="3211"/>
+          </w:tcPr>
+          <w:p>
+            <w:pPr>
+              <w:spacing w:after="20"/>
+            </w:pPr>
+            <w:r/>
+            <w:r>
+              <w:rPr>
+                <w:rFonts w:ascii="Calibri" w:hAnsi="Calibri" w:eastAsia="微软雅黑"/>
+                <w:b w:val="0"/>
+                <w:sz w:val="18"/>
+              </w:rPr>
+              <w:t>first confrontation between hand numbers and physics</w:t>
+            </w:r>
+          </w:p>
+        </w:tc>
+      </w:tr>
+      <w:tr>
+        <w:tc>
+          <w:tcPr>
+            <w:tcW w:type="dxa" w:w="3211"/>
+          </w:tcPr>
+          <w:p>
+            <w:pPr>
+              <w:spacing w:after="20"/>
+            </w:pPr>
+            <w:r/>
+            <w:r>
+              <w:rPr>
+                <w:rFonts w:ascii="Calibri" w:hAnsi="Calibri" w:eastAsia="微软雅黑"/>
+                <w:b w:val="0"/>
+                <w:sz w:val="18"/>
+              </w:rPr>
+              <w:t>8</w:t>
+            </w:r>
+          </w:p>
+        </w:tc>
+        <w:tc>
+          <w:tcPr>
+            <w:tcW w:type="dxa" w:w="3211"/>
+          </w:tcPr>
+          <w:p>
+            <w:pPr>
+              <w:spacing w:after="20"/>
+            </w:pPr>
+            <w:r/>
+            <w:r>
+              <w:rPr>
+                <w:rFonts w:ascii="Calibri" w:hAnsi="Calibri" w:eastAsia="微软雅黑"/>
+                <w:b w:val="0"/>
+                <w:sz w:val="18"/>
+              </w:rPr>
+              <w:t>Noise-contribution analysis</w:t>
+            </w:r>
+          </w:p>
+        </w:tc>
+        <w:tc>
+          <w:tcPr>
+            <w:tcW w:type="dxa" w:w="3211"/>
+          </w:tcPr>
+          <w:p>
+            <w:pPr>
+              <w:spacing w:after="20"/>
+            </w:pPr>
+            <w:r/>
+            <w:r>
+              <w:rPr>
+                <w:rFonts w:ascii="Calibri" w:hAnsi="Calibri" w:eastAsia="微软雅黑"/>
+                <w:b w:val="0"/>
+                <w:sz w:val="18"/>
+              </w:rPr>
+              <w:t>which device eats the noise budget</w:t>
+            </w:r>
+          </w:p>
+        </w:tc>
+      </w:tr>
+      <w:tr>
+        <w:tc>
+          <w:tcPr>
+            <w:tcW w:type="dxa" w:w="3211"/>
+          </w:tcPr>
+          <w:p>
+            <w:pPr>
+              <w:spacing w:after="20"/>
+            </w:pPr>
+            <w:r/>
+            <w:r>
+              <w:rPr>
+                <w:rFonts w:ascii="Calibri" w:hAnsi="Calibri" w:eastAsia="微软雅黑"/>
+                <w:b w:val="0"/>
+                <w:sz w:val="18"/>
+              </w:rPr>
+              <w:t>9</w:t>
+            </w:r>
+          </w:p>
+        </w:tc>
+        <w:tc>
+          <w:tcPr>
+            <w:tcW w:type="dxa" w:w="3211"/>
+          </w:tcPr>
+          <w:p>
+            <w:pPr>
+              <w:spacing w:after="20"/>
+            </w:pPr>
+            <w:r/>
+            <w:r>
+              <w:rPr>
+                <w:rFonts w:ascii="Calibri" w:hAnsi="Calibri" w:eastAsia="微软雅黑"/>
+                <w:b w:val="0"/>
+                <w:sz w:val="18"/>
+              </w:rPr>
+              <w:t>Architecture / system behavioral simulation</w:t>
+            </w:r>
+          </w:p>
+        </w:tc>
+        <w:tc>
+          <w:tcPr>
+            <w:tcW w:type="dxa" w:w="3211"/>
+          </w:tcPr>
+          <w:p>
+            <w:pPr>
+              <w:spacing w:after="20"/>
+            </w:pPr>
+            <w:r/>
+            <w:r>
+              <w:rPr>
+                <w:rFonts w:ascii="Calibri" w:hAnsi="Calibri" w:eastAsia="微软雅黑"/>
+                <w:b w:val="0"/>
+                <w:sz w:val="18"/>
+              </w:rPr>
+              <w:t>loop-level behaviour before transistor-level grind</w:t>
+            </w:r>
+          </w:p>
+        </w:tc>
+      </w:tr>
+      <w:tr>
+        <w:tc>
+          <w:tcPr>
+            <w:tcW w:type="dxa" w:w="3211"/>
+          </w:tcPr>
+          <w:p>
+            <w:pPr>
+              <w:spacing w:after="20"/>
+            </w:pPr>
+            <w:r/>
+            <w:r>
+              <w:rPr>
+                <w:rFonts w:ascii="Calibri" w:hAnsi="Calibri" w:eastAsia="微软雅黑"/>
+                <w:b w:val="0"/>
+                <w:sz w:val="18"/>
+              </w:rPr>
+              <w:t>10</w:t>
+            </w:r>
+          </w:p>
+        </w:tc>
+        <w:tc>
+          <w:tcPr>
+            <w:tcW w:type="dxa" w:w="3211"/>
+          </w:tcPr>
+          <w:p>
+            <w:pPr>
+              <w:spacing w:after="20"/>
+            </w:pPr>
+            <w:r/>
+            <w:r>
+              <w:rPr>
+                <w:rFonts w:ascii="Calibri" w:hAnsi="Calibri" w:eastAsia="微软雅黑"/>
+                <w:b w:val="0"/>
+                <w:sz w:val="18"/>
+              </w:rPr>
+              <w:t>PVT corners</w:t>
+            </w:r>
+          </w:p>
+        </w:tc>
+        <w:tc>
+          <w:tcPr>
+            <w:tcW w:type="dxa" w:w="3211"/>
+          </w:tcPr>
+          <w:p>
+            <w:pPr>
+              <w:spacing w:after="20"/>
+            </w:pPr>
+            <w:r/>
+            <w:r>
+              <w:rPr>
+                <w:rFonts w:ascii="Calibri" w:hAnsi="Calibri" w:eastAsia="微软雅黑"/>
+                <w:b w:val="0"/>
+                <w:sz w:val="18"/>
+              </w:rPr>
+              <w:t>does it survive process, voltage, temperature</w:t>
+            </w:r>
+          </w:p>
+        </w:tc>
+      </w:tr>
+      <w:tr>
+        <w:tc>
+          <w:tcPr>
+            <w:tcW w:type="dxa" w:w="3211"/>
+          </w:tcPr>
+          <w:p>
+            <w:pPr>
+              <w:spacing w:after="20"/>
+            </w:pPr>
+            <w:r/>
+            <w:r>
+              <w:rPr>
+                <w:rFonts w:ascii="Calibri" w:hAnsi="Calibri" w:eastAsia="微软雅黑"/>
+                <w:b w:val="0"/>
+                <w:sz w:val="18"/>
+              </w:rPr>
+              <w:t>11</w:t>
+            </w:r>
+          </w:p>
+        </w:tc>
+        <w:tc>
+          <w:tcPr>
+            <w:tcW w:type="dxa" w:w="3211"/>
+          </w:tcPr>
+          <w:p>
+            <w:pPr>
+              <w:spacing w:after="20"/>
+            </w:pPr>
+            <w:r/>
+            <w:r>
+              <w:rPr>
+                <w:rFonts w:ascii="Calibri" w:hAnsi="Calibri" w:eastAsia="微软雅黑"/>
+                <w:b w:val="0"/>
+                <w:sz w:val="18"/>
+              </w:rPr>
+              <w:t>Monte Carlo / mismatch</w:t>
+            </w:r>
+          </w:p>
+        </w:tc>
+        <w:tc>
+          <w:tcPr>
+            <w:tcW w:type="dxa" w:w="3211"/>
+          </w:tcPr>
+          <w:p>
+            <w:pPr>
+              <w:spacing w:after="20"/>
+            </w:pPr>
+            <w:r/>
+            <w:r>
+              <w:rPr>
+                <w:rFonts w:ascii="Calibri" w:hAnsi="Calibri" w:eastAsia="微软雅黑"/>
+                <w:b w:val="0"/>
+                <w:sz w:val="18"/>
+              </w:rPr>
+              <w:t>a distribution, not a point</w:t>
+            </w:r>
+          </w:p>
+        </w:tc>
+      </w:tr>
+      <w:tr>
+        <w:tc>
+          <w:tcPr>
+            <w:tcW w:type="dxa" w:w="3211"/>
+          </w:tcPr>
+          <w:p>
+            <w:pPr>
+              <w:spacing w:after="20"/>
+            </w:pPr>
+            <w:r/>
+            <w:r>
+              <w:rPr>
+                <w:rFonts w:ascii="Calibri" w:hAnsi="Calibri" w:eastAsia="微软雅黑"/>
+                <w:b w:val="0"/>
+                <w:sz w:val="18"/>
+              </w:rPr>
+              <w:t>12</w:t>
+            </w:r>
+          </w:p>
+        </w:tc>
+        <w:tc>
+          <w:tcPr>
+            <w:tcW w:type="dxa" w:w="3211"/>
+          </w:tcPr>
+          <w:p>
+            <w:pPr>
+              <w:spacing w:after="20"/>
+            </w:pPr>
+            <w:r/>
+            <w:r>
+              <w:rPr>
+                <w:rFonts w:ascii="Calibri" w:hAnsi="Calibri" w:eastAsia="微软雅黑"/>
+                <w:b w:val="0"/>
+                <w:sz w:val="18"/>
+              </w:rPr>
+              <w:t>Automated optimization / design centering</w:t>
+            </w:r>
+          </w:p>
+        </w:tc>
+        <w:tc>
+          <w:tcPr>
+            <w:tcW w:type="dxa" w:w="3211"/>
+          </w:tcPr>
+          <w:p>
+            <w:pPr>
+              <w:spacing w:after="20"/>
+            </w:pPr>
+            <w:r/>
+            <w:r>
+              <w:rPr>
+                <w:rFonts w:ascii="Calibri" w:hAnsi="Calibri" w:eastAsia="微软雅黑"/>
+                <w:b w:val="0"/>
+                <w:sz w:val="18"/>
+              </w:rPr>
+              <w:t>move the distribution, not the nominal</w:t>
+            </w:r>
+          </w:p>
+        </w:tc>
+      </w:tr>
+      <w:tr>
+        <w:tc>
+          <w:tcPr>
+            <w:tcW w:type="dxa" w:w="3211"/>
+          </w:tcPr>
+          <w:p>
+            <w:pPr>
+              <w:spacing w:after="20"/>
+            </w:pPr>
+            <w:r/>
+            <w:r>
+              <w:rPr>
+                <w:rFonts w:ascii="Calibri" w:hAnsi="Calibri" w:eastAsia="微软雅黑"/>
+                <w:b w:val="0"/>
+                <w:sz w:val="18"/>
+              </w:rPr>
+              <w:t>13</w:t>
+            </w:r>
+          </w:p>
+        </w:tc>
+        <w:tc>
+          <w:tcPr>
+            <w:tcW w:type="dxa" w:w="3211"/>
+          </w:tcPr>
+          <w:p>
+            <w:pPr>
+              <w:spacing w:after="20"/>
+            </w:pPr>
+            <w:r/>
+            <w:r>
+              <w:rPr>
+                <w:rFonts w:ascii="Calibri" w:hAnsi="Calibri" w:eastAsia="微软雅黑"/>
+                <w:b w:val="0"/>
+                <w:sz w:val="18"/>
+              </w:rPr>
+              <w:t>Early floorplan</w:t>
+            </w:r>
+          </w:p>
+        </w:tc>
+        <w:tc>
+          <w:tcPr>
+            <w:tcW w:type="dxa" w:w="3211"/>
+          </w:tcPr>
+          <w:p>
+            <w:pPr>
+              <w:spacing w:after="20"/>
+            </w:pPr>
+            <w:r/>
+            <w:r>
+              <w:rPr>
+                <w:rFonts w:ascii="Calibri" w:hAnsi="Calibri" w:eastAsia="微软雅黑"/>
+                <w:b w:val="0"/>
+                <w:sz w:val="18"/>
+              </w:rPr>
+              <w:t>critical devices placed before routing exists</w:t>
+            </w:r>
+          </w:p>
+        </w:tc>
+      </w:tr>
+      <w:tr>
+        <w:tc>
+          <w:tcPr>
+            <w:tcW w:type="dxa" w:w="3211"/>
+          </w:tcPr>
+          <w:p>
+            <w:pPr>
+              <w:spacing w:after="20"/>
+            </w:pPr>
+            <w:r/>
+            <w:r>
+              <w:rPr>
+                <w:rFonts w:ascii="Calibri" w:hAnsi="Calibri" w:eastAsia="微软雅黑"/>
+                <w:b w:val="0"/>
+                <w:sz w:val="18"/>
+              </w:rPr>
+              <w:t>14</w:t>
+            </w:r>
+          </w:p>
+        </w:tc>
+        <w:tc>
+          <w:tcPr>
+            <w:tcW w:type="dxa" w:w="3211"/>
+          </w:tcPr>
+          <w:p>
+            <w:pPr>
+              <w:spacing w:after="20"/>
+            </w:pPr>
+            <w:r/>
+            <w:r>
+              <w:rPr>
+                <w:rFonts w:ascii="Calibri" w:hAnsi="Calibri" w:eastAsia="微软雅黑"/>
+                <w:b w:val="0"/>
+                <w:sz w:val="18"/>
+              </w:rPr>
+              <w:t>Critical-device layout</w:t>
+            </w:r>
+          </w:p>
+        </w:tc>
+        <w:tc>
+          <w:tcPr>
+            <w:tcW w:type="dxa" w:w="3211"/>
+          </w:tcPr>
+          <w:p>
+            <w:pPr>
+              <w:spacing w:after="20"/>
+            </w:pPr>
+            <w:r/>
+            <w:r>
+              <w:rPr>
+                <w:rFonts w:ascii="Calibri" w:hAnsi="Calibri" w:eastAsia="微软雅黑"/>
+                <w:b w:val="0"/>
+                <w:sz w:val="18"/>
+              </w:rPr>
+              <w:t>matching and parasitics by construction</w:t>
+            </w:r>
+          </w:p>
+        </w:tc>
+      </w:tr>
+      <w:tr>
+        <w:tc>
+          <w:tcPr>
+            <w:tcW w:type="dxa" w:w="3211"/>
+          </w:tcPr>
+          <w:p>
+            <w:pPr>
+              <w:spacing w:after="20"/>
+            </w:pPr>
+            <w:r/>
+            <w:r>
+              <w:rPr>
+                <w:rFonts w:ascii="Calibri" w:hAnsi="Calibri" w:eastAsia="微软雅黑"/>
+                <w:b w:val="0"/>
+                <w:sz w:val="18"/>
+              </w:rPr>
+              <w:t>15</w:t>
+            </w:r>
+          </w:p>
+        </w:tc>
+        <w:tc>
+          <w:tcPr>
+            <w:tcW w:type="dxa" w:w="3211"/>
+          </w:tcPr>
+          <w:p>
+            <w:pPr>
+              <w:spacing w:after="20"/>
+            </w:pPr>
+            <w:r/>
+            <w:r>
+              <w:rPr>
+                <w:rFonts w:ascii="Calibri" w:hAnsi="Calibri" w:eastAsia="微软雅黑"/>
+                <w:b w:val="0"/>
+                <w:sz w:val="18"/>
+              </w:rPr>
+              <w:t>Progressive PEX</w:t>
+            </w:r>
+          </w:p>
+        </w:tc>
+        <w:tc>
+          <w:tcPr>
+            <w:tcW w:type="dxa" w:w="3211"/>
+          </w:tcPr>
+          <w:p>
+            <w:pPr>
+              <w:spacing w:after="20"/>
+            </w:pPr>
+            <w:r/>
+            <w:r>
+              <w:rPr>
+                <w:rFonts w:ascii="Calibri" w:hAnsi="Calibri" w:eastAsia="微软雅黑"/>
+                <w:b w:val="0"/>
+                <w:sz w:val="18"/>
+              </w:rPr>
+              <w:t>parasitics extracted incrementally, not at the end</w:t>
+            </w:r>
+          </w:p>
+        </w:tc>
+      </w:tr>
+      <w:tr>
+        <w:tc>
+          <w:tcPr>
+            <w:tcW w:type="dxa" w:w="3211"/>
+          </w:tcPr>
+          <w:p>
+            <w:pPr>
+              <w:spacing w:after="20"/>
+            </w:pPr>
+            <w:r/>
+            <w:r>
+              <w:rPr>
+                <w:rFonts w:ascii="Calibri" w:hAnsi="Calibri" w:eastAsia="微软雅黑"/>
+                <w:b w:val="0"/>
+                <w:sz w:val="18"/>
+              </w:rPr>
+              <w:t>16</w:t>
+            </w:r>
+          </w:p>
+        </w:tc>
+        <w:tc>
+          <w:tcPr>
+            <w:tcW w:type="dxa" w:w="3211"/>
+          </w:tcPr>
+          <w:p>
+            <w:pPr>
+              <w:spacing w:after="20"/>
+            </w:pPr>
+            <w:r/>
+            <w:r>
+              <w:rPr>
+                <w:rFonts w:ascii="Calibri" w:hAnsi="Calibri" w:eastAsia="微软雅黑"/>
+                <w:b w:val="0"/>
+                <w:sz w:val="18"/>
+              </w:rPr>
+              <w:t>Post-layout noise / stability / PVT</w:t>
+            </w:r>
+          </w:p>
+        </w:tc>
+        <w:tc>
+          <w:tcPr>
+            <w:tcW w:type="dxa" w:w="3211"/>
+          </w:tcPr>
+          <w:p>
+            <w:pPr>
+              <w:spacing w:after="20"/>
+            </w:pPr>
+            <w:r/>
+            <w:r>
+              <w:rPr>
+                <w:rFonts w:ascii="Calibri" w:hAnsi="Calibri" w:eastAsia="微软雅黑"/>
+                <w:b w:val="0"/>
+                <w:sz w:val="18"/>
+              </w:rPr>
+              <w:t>the numbers you will actually get</w:t>
+            </w:r>
+          </w:p>
+        </w:tc>
+      </w:tr>
+      <w:tr>
+        <w:tc>
+          <w:tcPr>
+            <w:tcW w:type="dxa" w:w="3211"/>
+          </w:tcPr>
+          <w:p>
+            <w:pPr>
+              <w:spacing w:after="20"/>
+            </w:pPr>
+            <w:r/>
+            <w:r>
+              <w:rPr>
+                <w:rFonts w:ascii="Calibri" w:hAnsi="Calibri" w:eastAsia="微软雅黑"/>
+                <w:b w:val="0"/>
+                <w:sz w:val="18"/>
+              </w:rPr>
+              <w:t>17</w:t>
+            </w:r>
+          </w:p>
+        </w:tc>
+        <w:tc>
+          <w:tcPr>
+            <w:tcW w:type="dxa" w:w="3211"/>
+          </w:tcPr>
+          <w:p>
+            <w:pPr>
+              <w:spacing w:after="20"/>
+            </w:pPr>
+            <w:r/>
+            <w:r>
+              <w:rPr>
+                <w:rFonts w:ascii="Calibri" w:hAnsi="Calibri" w:eastAsia="微软雅黑"/>
+                <w:b w:val="0"/>
+                <w:sz w:val="18"/>
+              </w:rPr>
+              <w:t>High-sigma / yield analysis</w:t>
+            </w:r>
+          </w:p>
+        </w:tc>
+        <w:tc>
+          <w:tcPr>
+            <w:tcW w:type="dxa" w:w="3211"/>
+          </w:tcPr>
+          <w:p>
+            <w:pPr>
+              <w:spacing w:after="20"/>
+            </w:pPr>
+            <w:r/>
+            <w:r>
+              <w:rPr>
+                <w:rFonts w:ascii="Calibri" w:hAnsi="Calibri" w:eastAsia="微软雅黑"/>
+                <w:b w:val="0"/>
+                <w:sz w:val="18"/>
+              </w:rPr>
+              <w:t>six-sigma corners, not three-sigma hope</w:t>
+            </w:r>
+          </w:p>
+        </w:tc>
+      </w:tr>
+      <w:tr>
+        <w:tc>
+          <w:tcPr>
+            <w:tcW w:type="dxa" w:w="3211"/>
+          </w:tcPr>
+          <w:p>
+            <w:pPr>
+              <w:spacing w:after="20"/>
+            </w:pPr>
+            <w:r/>
+            <w:r>
+              <w:rPr>
+                <w:rFonts w:ascii="Calibri" w:hAnsi="Calibri" w:eastAsia="微软雅黑"/>
+                <w:b w:val="0"/>
+                <w:sz w:val="18"/>
+              </w:rPr>
+              <w:t>18</w:t>
+            </w:r>
+          </w:p>
+        </w:tc>
+        <w:tc>
+          <w:tcPr>
+            <w:tcW w:type="dxa" w:w="3211"/>
+          </w:tcPr>
+          <w:p>
+            <w:pPr>
+              <w:spacing w:after="20"/>
+            </w:pPr>
+            <w:r/>
+            <w:r>
+              <w:rPr>
+                <w:rFonts w:ascii="Calibri" w:hAnsi="Calibri" w:eastAsia="微软雅黑"/>
+                <w:b w:val="0"/>
+                <w:sz w:val="18"/>
+              </w:rPr>
+              <w:t>Reliability / aging / EMIR</w:t>
+            </w:r>
+          </w:p>
+        </w:tc>
+        <w:tc>
+          <w:tcPr>
+            <w:tcW w:type="dxa" w:w="3211"/>
+          </w:tcPr>
+          <w:p>
+            <w:pPr>
+              <w:spacing w:after="20"/>
+            </w:pPr>
+            <w:r/>
+            <w:r>
+              <w:rPr>
+                <w:rFonts w:ascii="Calibri" w:hAnsi="Calibri" w:eastAsia="微软雅黑"/>
+                <w:b w:val="0"/>
+                <w:sz w:val="18"/>
+              </w:rPr>
+              <w:t>it must still work in ten years</w:t>
+            </w:r>
+          </w:p>
+        </w:tc>
+      </w:tr>
+      <w:tr>
+        <w:tc>
+          <w:tcPr>
+            <w:tcW w:type="dxa" w:w="3211"/>
+          </w:tcPr>
+          <w:p>
+            <w:pPr>
+              <w:spacing w:after="20"/>
+            </w:pPr>
+            <w:r/>
+            <w:r>
+              <w:rPr>
+                <w:rFonts w:ascii="Calibri" w:hAnsi="Calibri" w:eastAsia="微软雅黑"/>
+                <w:b w:val="0"/>
+                <w:sz w:val="18"/>
+              </w:rPr>
+              <w:t>19</w:t>
+            </w:r>
+          </w:p>
+        </w:tc>
+        <w:tc>
+          <w:tcPr>
+            <w:tcW w:type="dxa" w:w="3211"/>
+          </w:tcPr>
+          <w:p>
+            <w:pPr>
+              <w:spacing w:after="20"/>
+            </w:pPr>
+            <w:r/>
+            <w:r>
+              <w:rPr>
+                <w:rFonts w:ascii="Calibri" w:hAnsi="Calibri" w:eastAsia="微软雅黑"/>
+                <w:b w:val="0"/>
+                <w:sz w:val="18"/>
+              </w:rPr>
+              <w:t>AMS / full-chip verification</w:t>
+            </w:r>
+          </w:p>
+        </w:tc>
+        <w:tc>
+          <w:tcPr>
+            <w:tcW w:type="dxa" w:w="3211"/>
+          </w:tcPr>
+          <w:p>
+            <w:pPr>
+              <w:spacing w:after="20"/>
+            </w:pPr>
+            <w:r/>
+            <w:r>
+              <w:rPr>
+                <w:rFonts w:ascii="Calibri" w:hAnsi="Calibri" w:eastAsia="微软雅黑"/>
+                <w:b w:val="0"/>
+                <w:sz w:val="18"/>
+              </w:rPr>
+              <w:t>the analog block inside its digital context</w:t>
+            </w:r>
+          </w:p>
+        </w:tc>
+      </w:tr>
+      <w:tr>
+        <w:tc>
+          <w:tcPr>
+            <w:tcW w:type="dxa" w:w="3211"/>
+          </w:tcPr>
+          <w:p>
+            <w:pPr>
+              <w:spacing w:after="20"/>
+            </w:pPr>
+            <w:r/>
+            <w:r>
+              <w:rPr>
+                <w:rFonts w:ascii="Calibri" w:hAnsi="Calibri" w:eastAsia="微软雅黑"/>
+                <w:b w:val="0"/>
+                <w:sz w:val="18"/>
+              </w:rPr>
+              <w:t>20</w:t>
+            </w:r>
+          </w:p>
+        </w:tc>
+        <w:tc>
+          <w:tcPr>
+            <w:tcW w:type="dxa" w:w="3211"/>
+          </w:tcPr>
+          <w:p>
+            <w:pPr>
+              <w:spacing w:after="20"/>
+            </w:pPr>
+            <w:r/>
+            <w:r>
+              <w:rPr>
+                <w:rFonts w:ascii="Calibri" w:hAnsi="Calibri" w:eastAsia="微软雅黑"/>
+                <w:b w:val="0"/>
+                <w:sz w:val="18"/>
+              </w:rPr>
+              <w:t>Tapeout → characterization → model correlation</w:t>
+            </w:r>
+          </w:p>
+        </w:tc>
+        <w:tc>
+          <w:tcPr>
+            <w:tcW w:type="dxa" w:w="3211"/>
+          </w:tcPr>
+          <w:p>
+            <w:pPr>
+              <w:spacing w:after="20"/>
+            </w:pPr>
+            <w:r/>
+            <w:r>
+              <w:rPr>
+                <w:rFonts w:ascii="Calibri" w:hAnsi="Calibri" w:eastAsia="微软雅黑"/>
+                <w:b w:val="0"/>
+                <w:sz w:val="18"/>
+              </w:rPr>
+              <w:t>silicon measured vs silicon predicted</w:t>
+            </w:r>
+          </w:p>
+        </w:tc>
+      </w:tr>
+    </w:tbl>
+    <w:p>
+      <w:pPr>
+        <w:spacing w:after="80"/>
+      </w:pPr>
+    </w:p>
+    <w:p>
+      <w:pPr>
+        <w:spacing w:after="120" w:line="288" w:lineRule="auto"/>
+      </w:pPr>
+      <w:r>
+        <w:rPr>
+          <w:rFonts w:ascii="Calibri" w:hAnsi="Calibri" w:eastAsia="微软雅黑"/>
+          <w:b w:val="0"/>
+          <w:sz w:val="21"/>
+        </w:rPr>
+        <w:t>Phases 1–3, 10–12, 16–17 and 20 are exactly where this tutorial's gate philosophy</w:t>
+      </w:r>
+    </w:p>
+    <w:p>
+      <w:pPr>
+        <w:spacing w:after="120" w:line="288" w:lineRule="auto"/>
+      </w:pPr>
+      <w:r>
+        <w:rPr>
+          <w:rFonts w:ascii="Calibri" w:hAnsi="Calibri" w:eastAsia="微软雅黑"/>
+          <w:b w:val="0"/>
+          <w:sz w:val="21"/>
+        </w:rPr>
+        <w:t>lives: each produces an artifact that either agrees with a previous artifact or</w:t>
+      </w:r>
+    </w:p>
+    <w:p>
+      <w:pPr>
+        <w:spacing w:after="120" w:line="288" w:lineRule="auto"/>
+      </w:pPr>
+      <w:r>
+        <w:rPr>
+          <w:rFonts w:ascii="Calibri" w:hAnsi="Calibri" w:eastAsia="微软雅黑"/>
+          <w:b w:val="0"/>
+          <w:sz w:val="21"/>
+        </w:rPr>
+        <w:t>explains, with evidence, why it does not.</w:t>
+      </w:r>
+    </w:p>
+    <w:p>
+      <w:pPr>
+        <w:spacing w:after="120" w:line="288" w:lineRule="auto"/>
+      </w:pPr>
+      <w:r>
+        <w:rPr>
+          <w:rFonts w:ascii="Calibri" w:hAnsi="Calibri" w:eastAsia="微软雅黑"/>
+          <w:b/>
+          <w:sz w:val="21"/>
+        </w:rPr>
+        <w:t>For PG students:</w:t>
+      </w:r>
+      <w:r>
+        <w:rPr>
+          <w:rFonts w:ascii="Calibri" w:hAnsi="Calibri" w:eastAsia="微软雅黑"/>
+          <w:b w:val="0"/>
+          <w:sz w:val="21"/>
+        </w:rPr>
+        <w:t xml:space="preserve"> learn this sequence before you learn any tool. The sequence</w:t>
+      </w:r>
+    </w:p>
+    <w:p>
+      <w:pPr>
+        <w:spacing w:after="120" w:line="288" w:lineRule="auto"/>
+      </w:pPr>
+      <w:r>
+        <w:rPr>
+          <w:rFonts w:ascii="Calibri" w:hAnsi="Calibri" w:eastAsia="微软雅黑"/>
+          <w:b w:val="0"/>
+          <w:sz w:val="21"/>
+        </w:rPr>
+        <w:t>*is* the expertise; the tools are interchangeable.</w:t>
+      </w:r>
+    </w:p>
+    <w:p>
+      <w:pPr>
+        <w:keepNext/>
+        <w:spacing w:before="280" w:after="100"/>
+      </w:pPr>
+      <w:r>
+        <w:rPr>
+          <w:rFonts w:ascii="Calibri" w:hAnsi="Calibri" w:eastAsia="微软雅黑"/>
+          <w:b/>
+          <w:color w:val="061F32"/>
+          <w:sz w:val="32"/>
+        </w:rPr>
+        <w:t>9.6 The philosophy in one line</w:t>
+      </w:r>
+    </w:p>
+    <w:p>
+      <w:pPr>
+        <w:spacing w:after="120" w:line="288" w:lineRule="auto"/>
+      </w:pPr>
+      <w:r>
+        <w:rPr>
+          <w:rFonts w:ascii="Calibri" w:hAnsi="Calibri" w:eastAsia="微软雅黑"/>
+          <w:b w:val="0"/>
+          <w:sz w:val="21"/>
+        </w:rPr>
+        <w:t>The whole workflow compresses to:</w:t>
+      </w:r>
+    </w:p>
+    <w:tbl>
+      <w:tblPr>
+        <w:tblW w:type="auto" w:w="0"/>
+        <w:jc w:val="center"/>
+        <w:tblLook w:firstColumn="1" w:firstRow="1" w:lastColumn="0" w:lastRow="0" w:noHBand="0" w:noVBand="1" w:val="04A0"/>
+      </w:tblPr>
+      <w:tblGrid>
+        <w:gridCol w:w="9632"/>
+      </w:tblGrid>
+      <w:tr>
+        <w:tc>
+          <w:tcPr>
+            <w:tcW w:type="dxa" w:w="9632"/>
+            <w:shd w:val="clear" w:fill="F4F6F8"/>
+          </w:tcPr>
+          <w:p>
+            <w:pPr>
+              <w:spacing w:after="0" w:before="0" w:line="240" w:lineRule="auto"/>
+            </w:pPr>
+            <w:r/>
+            <w:r>
+              <w:rPr>
+                <w:rFonts w:ascii="Consolas" w:hAnsi="Consolas" w:eastAsia="Consolas"/>
+                <w:b w:val="0"/>
+                <w:color w:val="1A1A1A"/>
+                <w:sz w:val="17"/>
+              </w:rPr>
+              <w:t>Specs → Physics → Architecture → Optimization → Statistics → Layout → Silicon</w:t>
+            </w:r>
+          </w:p>
+        </w:tc>
+      </w:tr>
+    </w:tbl>
+    <w:p>
+      <w:pPr>
+        <w:spacing w:after="80"/>
+      </w:pPr>
+    </w:p>
+    <w:p>
+      <w:pPr>
+        <w:spacing w:after="120" w:line="288" w:lineRule="auto"/>
+      </w:pPr>
+      <w:r>
+        <w:rPr>
+          <w:rFonts w:ascii="Calibri" w:hAnsi="Calibri" w:eastAsia="微软雅黑"/>
+          <w:b w:val="0"/>
+          <w:sz w:val="21"/>
+        </w:rPr>
+        <w:t xml:space="preserve">and emphatically </w:t>
+      </w:r>
+      <w:r>
+        <w:rPr>
+          <w:rFonts w:ascii="Calibri" w:hAnsi="Calibri" w:eastAsia="微软雅黑"/>
+          <w:b/>
+          <w:sz w:val="21"/>
+        </w:rPr>
+        <w:t>not</w:t>
+      </w:r>
+      <w:r>
+        <w:rPr>
+          <w:rFonts w:ascii="Calibri" w:hAnsi="Calibri" w:eastAsia="微软雅黑"/>
+          <w:b w:val="0"/>
+          <w:sz w:val="21"/>
+        </w:rPr>
+        <w:t xml:space="preserve"> to:</w:t>
+      </w:r>
+    </w:p>
+    <w:tbl>
+      <w:tblPr>
+        <w:tblW w:type="auto" w:w="0"/>
+        <w:jc w:val="center"/>
+        <w:tblLook w:firstColumn="1" w:firstRow="1" w:lastColumn="0" w:lastRow="0" w:noHBand="0" w:noVBand="1" w:val="04A0"/>
+      </w:tblPr>
+      <w:tblGrid>
+        <w:gridCol w:w="9632"/>
+      </w:tblGrid>
+      <w:tr>
+        <w:tc>
+          <w:tcPr>
+            <w:tcW w:type="dxa" w:w="9632"/>
+            <w:shd w:val="clear" w:fill="F4F6F8"/>
+          </w:tcPr>
+          <w:p>
+            <w:pPr>
+              <w:spacing w:after="0" w:before="0" w:line="240" w:lineRule="auto"/>
+            </w:pPr>
+            <w:r/>
+            <w:r>
+              <w:rPr>
+                <w:rFonts w:ascii="Consolas" w:hAnsi="Consolas" w:eastAsia="Consolas"/>
+                <w:b w:val="0"/>
+                <w:color w:val="1A1A1A"/>
+                <w:sz w:val="17"/>
+              </w:rPr>
+              <w:t>draw schematic → SPICE → layout</w:t>
+            </w:r>
+          </w:p>
+        </w:tc>
+      </w:tr>
+    </w:tbl>
+    <w:p>
+      <w:pPr>
+        <w:spacing w:after="80"/>
+      </w:pPr>
+    </w:p>
+    <w:p>
+      <w:pPr>
+        <w:spacing w:after="120" w:line="288" w:lineRule="auto"/>
+      </w:pPr>
+      <w:r>
+        <w:rPr>
+          <w:rFonts w:ascii="Calibri" w:hAnsi="Calibri" w:eastAsia="微软雅黑"/>
+          <w:b w:val="0"/>
+          <w:sz w:val="21"/>
+        </w:rPr>
+        <w:t>Every arrow in that chain is a gate in the sense of Part 5: something crosses it</w:t>
+      </w:r>
+    </w:p>
+    <w:p>
+      <w:pPr>
+        <w:spacing w:after="120" w:line="288" w:lineRule="auto"/>
+      </w:pPr>
+      <w:r>
+        <w:rPr>
+          <w:rFonts w:ascii="Calibri" w:hAnsi="Calibri" w:eastAsia="微软雅黑"/>
+          <w:b w:val="0"/>
+          <w:sz w:val="21"/>
+        </w:rPr>
+        <w:t>(an artifact, a number, a distribution) and something judges it (a hand</w:t>
+      </w:r>
+    </w:p>
+    <w:p>
+      <w:pPr>
+        <w:spacing w:after="120" w:line="288" w:lineRule="auto"/>
+      </w:pPr>
+      <w:r>
+        <w:rPr>
+          <w:rFonts w:ascii="Calibri" w:hAnsi="Calibri" w:eastAsia="微软雅黑"/>
+          <w:b w:val="0"/>
+          <w:sz w:val="21"/>
+        </w:rPr>
+        <w:t>calculation, a corner sweep, a measurement). If you cannot name the artifact that</w:t>
+      </w:r>
+    </w:p>
+    <w:p>
+      <w:pPr>
+        <w:spacing w:after="120" w:line="288" w:lineRule="auto"/>
+      </w:pPr>
+      <w:r>
+        <w:rPr>
+          <w:rFonts w:ascii="Calibri" w:hAnsi="Calibri" w:eastAsia="微软雅黑"/>
+          <w:b w:val="0"/>
+          <w:sz w:val="21"/>
+        </w:rPr>
+        <w:t>crosses an arrow, the arrow did not happen — write the phase down as VOID and</w:t>
+      </w:r>
+    </w:p>
+    <w:p>
+      <w:pPr>
+        <w:spacing w:after="120" w:line="288" w:lineRule="auto"/>
+      </w:pPr>
+      <w:r>
+        <w:rPr>
+          <w:rFonts w:ascii="Calibri" w:hAnsi="Calibri" w:eastAsia="微软雅黑"/>
+          <w:b w:val="0"/>
+          <w:sz w:val="21"/>
+        </w:rPr>
+        <w:t>move on honestly. This is the same exit-code discipline you applied to LVS:</w:t>
+      </w:r>
+    </w:p>
+    <w:p>
+      <w:pPr>
+        <w:spacing w:after="120" w:line="288" w:lineRule="auto"/>
+      </w:pPr>
+      <w:r>
+        <w:rPr>
+          <w:rFonts w:ascii="Calibri" w:hAnsi="Calibri" w:eastAsia="微软雅黑"/>
+          <w:b w:val="0"/>
+          <w:sz w:val="21"/>
+        </w:rPr>
+        <w:t>a stage that produced no comparable artifact did not pass, it merely ran.</w:t>
+      </w:r>
+    </w:p>
+    <w:p>
+      <w:pPr>
+        <w:keepNext/>
+        <w:spacing w:before="280" w:after="100"/>
+      </w:pPr>
+      <w:r>
+        <w:rPr>
+          <w:rFonts w:ascii="Calibri" w:hAnsi="Calibri" w:eastAsia="微软雅黑"/>
+          <w:b/>
+          <w:color w:val="061F32"/>
+          <w:sz w:val="32"/>
+        </w:rPr>
+        <w:t>9.7 Where AI belongs — the four levels</w:t>
+      </w:r>
+    </w:p>
+    <w:p>
+      <w:pPr>
+        <w:spacing w:after="120" w:line="288" w:lineRule="auto"/>
+      </w:pPr>
+      <w:r>
+        <w:rPr>
+          <w:rFonts w:ascii="Calibri" w:hAnsi="Calibri" w:eastAsia="微软雅黑"/>
+          <w:b w:val="0"/>
+          <w:sz w:val="21"/>
+        </w:rPr>
+        <w:t>Divide AI usage in analog IC design into four levels. The levels are defined not</w:t>
+      </w:r>
+    </w:p>
+    <w:p>
+      <w:pPr>
+        <w:spacing w:after="120" w:line="288" w:lineRule="auto"/>
+      </w:pPr>
+      <w:r>
+        <w:rPr>
+          <w:rFonts w:ascii="Calibri" w:hAnsi="Calibri" w:eastAsia="微软雅黑"/>
+          <w:b w:val="0"/>
+          <w:sz w:val="21"/>
+        </w:rPr>
+        <w:t xml:space="preserve">by what the AI *does* but by </w:t>
+      </w:r>
+      <w:r>
+        <w:rPr>
+          <w:rFonts w:ascii="Calibri" w:hAnsi="Calibri" w:eastAsia="微软雅黑"/>
+          <w:b/>
+          <w:sz w:val="21"/>
+        </w:rPr>
+        <w:t>what verifies it</w:t>
+      </w:r>
+      <w:r>
+        <w:rPr>
+          <w:rFonts w:ascii="Calibri" w:hAnsi="Calibri" w:eastAsia="微软雅黑"/>
+          <w:b w:val="0"/>
+          <w:sz w:val="21"/>
+        </w:rPr>
+        <w:t>:</w:t>
+      </w:r>
+    </w:p>
+    <w:tbl>
+      <w:tblPr>
+        <w:tblStyle w:val="TableGrid"/>
+        <w:tblW w:type="auto" w:w="0"/>
+        <w:jc w:val="center"/>
+        <w:tblLook w:firstColumn="1" w:firstRow="1" w:lastColumn="0" w:lastRow="0" w:noHBand="0" w:noVBand="1" w:val="04A0"/>
+      </w:tblPr>
+      <w:tblGrid>
+        <w:gridCol w:w="2408"/>
+        <w:gridCol w:w="2408"/>
+        <w:gridCol w:w="2408"/>
+        <w:gridCol w:w="2408"/>
+      </w:tblGrid>
+      <w:tr>
+        <w:tc>
+          <w:tcPr>
+            <w:tcW w:type="dxa" w:w="2408"/>
+            <w:shd w:val="clear" w:fill="061F32"/>
+          </w:tcPr>
+          <w:p>
+            <w:pPr>
+              <w:spacing w:after="20"/>
+            </w:pPr>
+            <w:r/>
+            <w:r>
+              <w:rPr>
+                <w:rFonts w:ascii="Calibri" w:hAnsi="Calibri" w:eastAsia="微软雅黑"/>
+                <w:b/>
+                <w:color w:val="FFFFFF"/>
+                <w:sz w:val="19"/>
+              </w:rPr>
+              <w:t>Level</w:t>
+            </w:r>
+          </w:p>
+        </w:tc>
+        <w:tc>
+          <w:tcPr>
+            <w:tcW w:type="dxa" w:w="2408"/>
+            <w:shd w:val="clear" w:fill="061F32"/>
+          </w:tcPr>
+          <w:p>
+            <w:pPr>
+              <w:spacing w:after="20"/>
+            </w:pPr>
+            <w:r/>
+            <w:r>
+              <w:rPr>
+                <w:rFonts w:ascii="Calibri" w:hAnsi="Calibri" w:eastAsia="微软雅黑"/>
+                <w:b/>
+                <w:color w:val="FFFFFF"/>
+                <w:sz w:val="19"/>
+              </w:rPr>
+              <w:t>AI does</w:t>
+            </w:r>
+          </w:p>
+        </w:tc>
+        <w:tc>
+          <w:tcPr>
+            <w:tcW w:type="dxa" w:w="2408"/>
+            <w:shd w:val="clear" w:fill="061F32"/>
+          </w:tcPr>
+          <w:p>
+            <w:pPr>
+              <w:spacing w:after="20"/>
+            </w:pPr>
+            <w:r/>
+            <w:r>
+              <w:rPr>
+                <w:rFonts w:ascii="Calibri" w:hAnsi="Calibri" w:eastAsia="微软雅黑"/>
+                <w:b/>
+                <w:color w:val="FFFFFF"/>
+                <w:sz w:val="19"/>
+              </w:rPr>
+              <w:t>Verified by</w:t>
+            </w:r>
+          </w:p>
+        </w:tc>
+        <w:tc>
+          <w:tcPr>
+            <w:tcW w:type="dxa" w:w="2408"/>
+            <w:shd w:val="clear" w:fill="061F32"/>
+          </w:tcPr>
+          <w:p>
+            <w:pPr>
+              <w:spacing w:after="20"/>
+            </w:pPr>
+            <w:r/>
+            <w:r>
+              <w:rPr>
+                <w:rFonts w:ascii="Calibri" w:hAnsi="Calibri" w:eastAsia="微软雅黑"/>
+                <w:b/>
+                <w:color w:val="FFFFFF"/>
+                <w:sz w:val="19"/>
+              </w:rPr>
+              <w:t>Status in 2026</w:t>
+            </w:r>
+          </w:p>
+        </w:tc>
+      </w:tr>
+      <w:tr>
+        <w:tc>
+          <w:tcPr>
+            <w:tcW w:type="dxa" w:w="2408"/>
+          </w:tcPr>
+          <w:p>
+            <w:pPr>
+              <w:spacing w:after="20"/>
+            </w:pPr>
+            <w:r/>
+            <w:r>
+              <w:rPr>
+                <w:rFonts w:ascii="Calibri" w:hAnsi="Calibri" w:eastAsia="微软雅黑"/>
+                <w:b/>
+                <w:sz w:val="18"/>
+              </w:rPr>
+              <w:t>1 — engineering assistant</w:t>
+            </w:r>
+          </w:p>
+        </w:tc>
+        <w:tc>
+          <w:tcPr>
+            <w:tcW w:type="dxa" w:w="2408"/>
+          </w:tcPr>
+          <w:p>
+            <w:pPr>
+              <w:spacing w:after="20"/>
+            </w:pPr>
+            <w:r/>
+            <w:r>
+              <w:rPr>
+                <w:rFonts w:ascii="Calibri" w:hAnsi="Calibri" w:eastAsia="微软雅黑"/>
+                <w:b w:val="0"/>
+                <w:sz w:val="18"/>
+              </w:rPr>
+              <w:t>derive equations; write Ocean/SKILL/Python scripts; generate test benches; analyse simulation logs; plot trade-offs</w:t>
+            </w:r>
+          </w:p>
+        </w:tc>
+        <w:tc>
+          <w:tcPr>
+            <w:tcW w:type="dxa" w:w="2408"/>
+          </w:tcPr>
+          <w:p>
+            <w:pPr>
+              <w:spacing w:after="20"/>
+            </w:pPr>
+            <w:r/>
+            <w:r>
+              <w:rPr>
+                <w:rFonts w:ascii="Calibri" w:hAnsi="Calibri" w:eastAsia="微软雅黑"/>
+                <w:b w:val="0"/>
+                <w:sz w:val="18"/>
+              </w:rPr>
+              <w:t>the engineer reads everything it produces</w:t>
+            </w:r>
+          </w:p>
+        </w:tc>
+        <w:tc>
+          <w:tcPr>
+            <w:tcW w:type="dxa" w:w="2408"/>
+          </w:tcPr>
+          <w:p>
+            <w:pPr>
+              <w:spacing w:after="20"/>
+            </w:pPr>
+            <w:r/>
+            <w:r>
+              <w:rPr>
+                <w:rFonts w:ascii="Calibri" w:hAnsi="Calibri" w:eastAsia="微软雅黑"/>
+                <w:b w:val="0"/>
+                <w:sz w:val="18"/>
+              </w:rPr>
+              <w:t>very useful today</w:t>
+            </w:r>
+          </w:p>
+        </w:tc>
+      </w:tr>
+      <w:tr>
+        <w:tc>
+          <w:tcPr>
+            <w:tcW w:type="dxa" w:w="2408"/>
+          </w:tcPr>
+          <w:p>
+            <w:pPr>
+              <w:spacing w:after="20"/>
+            </w:pPr>
+            <w:r/>
+            <w:r>
+              <w:rPr>
+                <w:rFonts w:ascii="Calibri" w:hAnsi="Calibri" w:eastAsia="微软雅黑"/>
+                <w:b/>
+                <w:sz w:val="18"/>
+              </w:rPr>
+              <w:t>2 — design-space optimizer</w:t>
+            </w:r>
+          </w:p>
+        </w:tc>
+        <w:tc>
+          <w:tcPr>
+            <w:tcW w:type="dxa" w:w="2408"/>
+          </w:tcPr>
+          <w:p>
+            <w:pPr>
+              <w:spacing w:after="20"/>
+            </w:pPr>
+            <w:r/>
+            <w:r>
+              <w:rPr>
+                <w:rFonts w:ascii="Calibri" w:hAnsi="Calibri" w:eastAsia="微软雅黑"/>
+                <w:b w:val="0"/>
+                <w:sz w:val="18"/>
+              </w:rPr>
+              <w:t>choose W, L, I_D, C, R inside constraints you set</w:t>
+            </w:r>
+          </w:p>
+        </w:tc>
+        <w:tc>
+          <w:tcPr>
+            <w:tcW w:type="dxa" w:w="2408"/>
+          </w:tcPr>
+          <w:p>
+            <w:pPr>
+              <w:spacing w:after="20"/>
+            </w:pPr>
+            <w:r/>
+            <w:r>
+              <w:rPr>
+                <w:rFonts w:ascii="Calibri" w:hAnsi="Calibri" w:eastAsia="微软雅黑"/>
+                <w:b w:val="0"/>
+                <w:sz w:val="18"/>
+              </w:rPr>
+              <w:t>the simulator — the only referee</w:t>
+            </w:r>
+          </w:p>
+        </w:tc>
+        <w:tc>
+          <w:tcPr>
+            <w:tcW w:type="dxa" w:w="2408"/>
+          </w:tcPr>
+          <w:p>
+            <w:pPr>
+              <w:spacing w:after="20"/>
+            </w:pPr>
+            <w:r/>
+            <w:r>
+              <w:rPr>
+                <w:rFonts w:ascii="Calibri" w:hAnsi="Calibri" w:eastAsia="微软雅黑"/>
+                <w:b w:val="0"/>
+                <w:sz w:val="18"/>
+              </w:rPr>
+              <w:t>very useful when constrained correctly</w:t>
+            </w:r>
+          </w:p>
+        </w:tc>
+      </w:tr>
+      <w:tr>
+        <w:tc>
+          <w:tcPr>
+            <w:tcW w:type="dxa" w:w="2408"/>
+          </w:tcPr>
+          <w:p>
+            <w:pPr>
+              <w:spacing w:after="20"/>
+            </w:pPr>
+            <w:r/>
+            <w:r>
+              <w:rPr>
+                <w:rFonts w:ascii="Calibri" w:hAnsi="Calibri" w:eastAsia="微软雅黑"/>
+                <w:b/>
+                <w:sz w:val="18"/>
+              </w:rPr>
+              <w:t>3 — layout assistant</w:t>
+            </w:r>
+          </w:p>
+        </w:tc>
+        <w:tc>
+          <w:tcPr>
+            <w:tcW w:type="dxa" w:w="2408"/>
+          </w:tcPr>
+          <w:p>
+            <w:pPr>
+              <w:spacing w:after="20"/>
+            </w:pPr>
+            <w:r/>
+            <w:r>
+              <w:rPr>
+                <w:rFonts w:ascii="Calibri" w:hAnsi="Calibri" w:eastAsia="微软雅黑"/>
+                <w:b w:val="0"/>
+                <w:sz w:val="18"/>
+              </w:rPr>
+              <w:t>placement, routing, constraint capture, parasitic optimization</w:t>
+            </w:r>
+          </w:p>
+        </w:tc>
+        <w:tc>
+          <w:tcPr>
+            <w:tcW w:type="dxa" w:w="2408"/>
+          </w:tcPr>
+          <w:p>
+            <w:pPr>
+              <w:spacing w:after="20"/>
+            </w:pPr>
+            <w:r/>
+            <w:r>
+              <w:rPr>
+                <w:rFonts w:ascii="Calibri" w:hAnsi="Calibri" w:eastAsia="微软雅黑"/>
+                <w:b w:val="0"/>
+                <w:sz w:val="18"/>
+              </w:rPr>
+              <w:t>DRC/LVS gates plus layout-aware checks</w:t>
+            </w:r>
+          </w:p>
+        </w:tc>
+        <w:tc>
+          <w:tcPr>
+            <w:tcW w:type="dxa" w:w="2408"/>
+          </w:tcPr>
+          <w:p>
+            <w:pPr>
+              <w:spacing w:after="20"/>
+            </w:pPr>
+            <w:r/>
+            <w:r>
+              <w:rPr>
+                <w:rFonts w:ascii="Calibri" w:hAnsi="Calibri" w:eastAsia="微软雅黑"/>
+                <w:b w:val="0"/>
+                <w:sz w:val="18"/>
+              </w:rPr>
+              <w:t>moving fast: Synopsys publicly describes an AI-assisted analog layout synthesis flow that captures design intent and constraints, produces DRC-clean layouts and performs layout-aware optimization; in 2026 it reported customer deployment progress and substantial reductions in layout iterations</w:t>
+            </w:r>
+          </w:p>
+        </w:tc>
+      </w:tr>
+      <w:tr>
+        <w:tc>
+          <w:tcPr>
+            <w:tcW w:type="dxa" w:w="2408"/>
+          </w:tcPr>
+          <w:p>
+            <w:pPr>
+              <w:spacing w:after="20"/>
+            </w:pPr>
+            <w:r/>
+            <w:r>
+              <w:rPr>
+                <w:rFonts w:ascii="Calibri" w:hAnsi="Calibri" w:eastAsia="微软雅黑"/>
+                <w:b/>
+                <w:sz w:val="18"/>
+              </w:rPr>
+              <w:t>4 — autonomous engineering agents</w:t>
+            </w:r>
+          </w:p>
+        </w:tc>
+        <w:tc>
+          <w:tcPr>
+            <w:tcW w:type="dxa" w:w="2408"/>
+          </w:tcPr>
+          <w:p>
+            <w:pPr>
+              <w:spacing w:after="20"/>
+            </w:pPr>
+            <w:r/>
+            <w:r>
+              <w:rPr>
+                <w:rFonts w:ascii="Calibri" w:hAnsi="Calibri" w:eastAsia="微软雅黑"/>
+                <w:b w:val="0"/>
+                <w:sz w:val="18"/>
+              </w:rPr>
+              <w:t>orchestrate EDA tasks end to end</w:t>
+            </w:r>
+          </w:p>
+        </w:tc>
+        <w:tc>
+          <w:tcPr>
+            <w:tcW w:type="dxa" w:w="2408"/>
+          </w:tcPr>
+          <w:p>
+            <w:pPr>
+              <w:spacing w:after="20"/>
+            </w:pPr>
+            <w:r/>
+            <w:r>
+              <w:rPr>
+                <w:rFonts w:ascii="Calibri" w:hAnsi="Calibri" w:eastAsia="微软雅黑"/>
+                <w:b w:val="0"/>
+                <w:sz w:val="18"/>
+              </w:rPr>
+              <w:t>physics-based EDA engines, continuously</w:t>
+            </w:r>
+          </w:p>
+        </w:tc>
+        <w:tc>
+          <w:tcPr>
+            <w:tcW w:type="dxa" w:w="2408"/>
+          </w:tcPr>
+          <w:p>
+            <w:pPr>
+              <w:spacing w:after="20"/>
+            </w:pPr>
+            <w:r/>
+            <w:r>
+              <w:rPr>
+                <w:rFonts w:ascii="Calibri" w:hAnsi="Calibri" w:eastAsia="微软雅黑"/>
+                <w:b w:val="0"/>
+                <w:sz w:val="18"/>
+              </w:rPr>
+              <w:t>emerging now: vendors integrate agentic systems that orchestrate EDA tasks but continuously check their conclusions against physics-based EDA engines — Siemens explicitly describes this "self-verifying" agent model rather than allowing an LLM alone to determine correctness</w:t>
+            </w:r>
+          </w:p>
+        </w:tc>
+      </w:tr>
+    </w:tbl>
+    <w:p>
+      <w:pPr>
+        <w:spacing w:after="80"/>
+      </w:pPr>
+    </w:p>
+    <w:p>
+      <w:pPr>
+        <w:spacing w:after="120" w:line="288" w:lineRule="auto"/>
+      </w:pPr>
+      <w:r>
+        <w:rPr>
+          <w:rFonts w:ascii="Calibri" w:hAnsi="Calibri" w:eastAsia="微软雅黑"/>
+          <w:b w:val="0"/>
+          <w:sz w:val="21"/>
+        </w:rPr>
+        <w:t>That distinction is crucial, and it is the whole point of this tutorial:</w:t>
+      </w:r>
+    </w:p>
+    <w:tbl>
+      <w:tblPr>
+        <w:tblW w:type="auto" w:w="0"/>
+        <w:tblLook w:firstColumn="1" w:firstRow="1" w:lastColumn="0" w:lastRow="0" w:noHBand="0" w:noVBand="1" w:val="04A0"/>
+      </w:tblPr>
+      <w:tblGrid>
+        <w:gridCol w:w="9632"/>
+      </w:tblGrid>
+      <w:tr>
+        <w:tc>
+          <w:tcPr>
+            <w:tcW w:type="dxa" w:w="9632"/>
+            <w:shd w:val="clear" w:fill="EAF4F9"/>
+          </w:tcPr>
+          <w:p>
+            <w:pPr>
+              <w:spacing w:after="40"/>
+            </w:pPr>
+            <w:r/>
+            <w:r>
+              <w:rPr>
+                <w:rFonts w:ascii="Calibri" w:hAnsi="Calibri" w:eastAsia="微软雅黑"/>
+                <w:b w:val="0"/>
+                <w:color w:val="061F32"/>
+                <w:sz w:val="20"/>
+              </w:rPr>
+              <w:t>**Level 4 is what this tutorial builds with open tools — under a different</w:t>
+            </w:r>
+          </w:p>
+          <w:p>
+            <w:pPr>
+              <w:spacing w:after="40"/>
+            </w:pPr>
+            <w:r>
+              <w:rPr>
+                <w:rFonts w:ascii="Calibri" w:hAnsi="Calibri" w:eastAsia="微软雅黑"/>
+                <w:b w:val="0"/>
+                <w:color w:val="061F32"/>
+                <w:sz w:val="20"/>
+              </w:rPr>
+              <w:t>name.** The two-key authority contract (Figure 0-1) is the same idea: the LLM</w:t>
+            </w:r>
+          </w:p>
+          <w:p>
+            <w:pPr>
+              <w:spacing w:after="40"/>
+            </w:pPr>
+            <w:r>
+              <w:rPr>
+                <w:rFonts w:ascii="Calibri" w:hAnsi="Calibri" w:eastAsia="微软雅黑"/>
+                <w:b w:val="0"/>
+                <w:color w:val="061F32"/>
+                <w:sz w:val="20"/>
+              </w:rPr>
+              <w:t>never determines correctness; the physics engine does. If a vendor promises</w:t>
+            </w:r>
+          </w:p>
+          <w:p>
+            <w:pPr>
+              <w:spacing w:after="40"/>
+            </w:pPr>
+            <w:r>
+              <w:rPr>
+                <w:rFonts w:ascii="Calibri" w:hAnsi="Calibri" w:eastAsia="微软雅黑"/>
+                <w:b w:val="0"/>
+                <w:color w:val="061F32"/>
+                <w:sz w:val="20"/>
+              </w:rPr>
+              <w:t>autonomous analog design without naming the engine that verifies it, you now</w:t>
+            </w:r>
+          </w:p>
+          <w:p>
+            <w:pPr>
+              <w:spacing w:after="40"/>
+            </w:pPr>
+            <w:r>
+              <w:rPr>
+                <w:rFonts w:ascii="Calibri" w:hAnsi="Calibri" w:eastAsia="微软雅黑"/>
+                <w:b w:val="0"/>
+                <w:color w:val="061F32"/>
+                <w:sz w:val="20"/>
+              </w:rPr>
+              <w:t>know exactly which question to ask.</w:t>
+            </w:r>
+          </w:p>
+        </w:tc>
+      </w:tr>
+    </w:tbl>
+    <w:p>
+      <w:pPr>
+        <w:spacing w:after="80"/>
+      </w:pPr>
     </w:p>
     <w:p>
       <w:pPr>

</xml_diff>